<commit_message>
Add VIRSYS registration form; fill team members and submission date
</commit_message>
<xml_diff>
--- a/submission/official/C-VIRSYS-DemoVideoGuide.docx
+++ b/submission/official/C-VIRSYS-DemoVideoGuide.docx
@@ -146,7 +146,7 @@
               <w:rPr>
                 <w:color w:val="17213A"/>
               </w:rPr>
-              <w:t>[SUBMISSION DATE]</w:t>
+              <w:t>20 October 2026</w:t>
             </w:r>
           </w:p>
         </w:tc>
@@ -214,7 +214,7 @@
         <w:ind w:left="317"/>
       </w:pPr>
       <w:r>
-        <w:t>Team introduction: VIRSYS and members — [TEAM MEMBERS] — shown on a team-intro card at 0:12–0:16 (the card reads “Team VIRSYS”; member names still to be added).</w:t>
+        <w:t>Team introduction: VIRSYS and members — Mohammad Shihab Hossain (AIUB, leader), Md Mobin Chowdhury (University of Dhaka) — shown on a team-intro card at 0:12–0:16 (the card reads “Team VIRSYS”; member names still to be added).</w:t>
       </w:r>
     </w:p>
     <w:p>

</xml_diff>